<commit_message>
docs: enrich Laporan Minggu 2 with Material 3 design system, color palette table, and safe area before-after screenshots
</commit_message>
<xml_diff>
--- a/Laporan_Minggu_2_LabInventory_Naila_Fathia.docx
+++ b/Laporan_Minggu_2_LabInventory_Naila_Fathia.docx
@@ -286,7 +286,7 @@
           <w:color w:val="000000"/>
           <w:sz w:val="26"/>
         </w:rPr>
-        <w:t>PENDAHULUAN &amp; DESAIN ANTARMUKA</w:t>
+        <w:t>PENDAHULUAN &amp; PRINSIP DESAIN UI/UX</w:t>
       </w:r>
     </w:p>
     <w:p>
@@ -314,7 +314,20 @@
           <w:rFonts w:ascii="Times New Roman" w:hAnsi="Times New Roman"/>
           <w:sz w:val="22"/>
         </w:rPr>
-        <w:t>Keberhasilan adopsi sistem informasi berbasis mobile sangat ditentukan oleh kualitas pengalaman pengguna (User Experience) dan estetika antarmuka (User Interface). Pada sistem inventaris laboratorium kampus, antarmuka dituntut tidak hanya menarik secara visual, namun juga harus intuitif, memiliki kontras tinggi untuk keterbacaan di dalam ruang laboratorium, serta memiliki alur navigasi yang tegas antara peran mahasiswa peminjam dan peran laboran pengelola.</w:t>
+        <w:t>Keberhasilan adopsi sistem informasi berbasis mobile sangat ditentukan oleh kualitas pengalaman pengguna (User Experience) dan estetika antarmuka (User Interface). Pada sistem inventaris laboratorium kampus, antarmuka dituntut tidak hanya menarik secara visual, namun juga harus intuitif, memiliki kontras tinggi untuk keterbacaan di dalam ruang laboratorium komputer, serta memiliki alur navigasi yang tegas antara peran mahasiswa peminjam dan peran laboran pengelola.</w:t>
+      </w:r>
+    </w:p>
+    <w:p>
+      <w:pPr>
+        <w:spacing w:after="160" w:line="312" w:lineRule="auto"/>
+        <w:jc w:val="both"/>
+      </w:pPr>
+      <w:r>
+        <w:rPr>
+          <w:rFonts w:ascii="Times New Roman" w:hAnsi="Times New Roman"/>
+          <w:sz w:val="22"/>
+        </w:rPr>
+        <w:t>Pada tahapan Minggu II, fokus rekayasa perangkat lunak diarahkan pada transformasi hasil analisis kebutuhan Minggu I menjadi komponen antarmuka nyata (slicing UI). Penerapan sistem desain yang konsisten mutlak diperlukan agar interaksi civitas akademika berjalan mulus, efisien, dan bebas hambatan visual.</w:t>
       </w:r>
     </w:p>
     <w:p>
@@ -329,7 +342,161 @@
           <w:color w:val="000000"/>
           <w:sz w:val="23"/>
         </w:rPr>
-        <w:t>1.2 Tujuan Praktikum Minggu II</w:t>
+        <w:t>1.2 Rumusan Masalah Desain Antarmuka</w:t>
+      </w:r>
+    </w:p>
+    <w:p>
+      <w:pPr>
+        <w:spacing w:after="160" w:line="312" w:lineRule="auto"/>
+        <w:jc w:val="both"/>
+      </w:pPr>
+      <w:r>
+        <w:rPr>
+          <w:rFonts w:ascii="Times New Roman" w:hAnsi="Times New Roman"/>
+          <w:sz w:val="22"/>
+        </w:rPr>
+        <w:t>Rumusan masalah yang diselesaikan pada tahapan desain antarmuka meliputi:</w:t>
+      </w:r>
+    </w:p>
+    <w:p>
+      <w:pPr>
+        <w:pStyle w:val="ListBullet"/>
+        <w:spacing w:after="80" w:line="288" w:lineRule="auto"/>
+        <w:jc w:val="both"/>
+      </w:pPr>
+      <w:r>
+        <w:rPr>
+          <w:rFonts w:ascii="Times New Roman" w:hAnsi="Times New Roman"/>
+          <w:sz w:val="22"/>
+        </w:rPr>
+        <w:t>Bagaimana merancang tema visual mobile yang selaras dengan identitas formal institusi Universitas Lampung?</w:t>
+      </w:r>
+    </w:p>
+    <w:p>
+      <w:pPr>
+        <w:pStyle w:val="ListBullet"/>
+        <w:spacing w:after="80" w:line="288" w:lineRule="auto"/>
+        <w:jc w:val="both"/>
+      </w:pPr>
+      <w:r>
+        <w:rPr>
+          <w:rFonts w:ascii="Times New Roman" w:hAnsi="Times New Roman"/>
+          <w:sz w:val="22"/>
+        </w:rPr>
+        <w:t>Bagaimana membangun struktur navigasi multi-role yang membedakan menu Mahasiswa (4 tab) dan Laboran (5 tab) tanpa terjadi reload data yang membebani memori?</w:t>
+      </w:r>
+    </w:p>
+    <w:p>
+      <w:pPr>
+        <w:pStyle w:val="ListBullet"/>
+        <w:spacing w:after="80" w:line="288" w:lineRule="auto"/>
+        <w:jc w:val="both"/>
+      </w:pPr>
+      <w:r>
+        <w:rPr>
+          <w:rFonts w:ascii="Times New Roman" w:hAnsi="Times New Roman"/>
+          <w:sz w:val="22"/>
+        </w:rPr>
+        <w:t>Bagaimana mengatasi kendala tumpang tindih layout antarmuka (bottom overflow) saat keyboard virtual Android aktif pada formulir pengajuan pinjam?</w:t>
+      </w:r>
+    </w:p>
+    <w:p>
+      <w:pPr>
+        <w:pStyle w:val="ListBullet"/>
+        <w:spacing w:after="80" w:line="288" w:lineRule="auto"/>
+        <w:jc w:val="both"/>
+      </w:pPr>
+      <w:r>
+        <w:rPr>
+          <w:rFonts w:ascii="Times New Roman" w:hAnsi="Times New Roman"/>
+          <w:sz w:val="22"/>
+        </w:rPr>
+        <w:t>Bagaimana menyediakan mekanisme evaluasi antarmuka yang independen (Mode Demo) agar dapat diuji tanpa ketergantungan koneksi jaringan backend?</w:t>
+      </w:r>
+    </w:p>
+    <w:p>
+      <w:pPr>
+        <w:keepNext/>
+        <w:spacing w:before="240" w:after="80"/>
+      </w:pPr>
+      <w:r>
+        <w:rPr>
+          <w:rFonts w:ascii="Times New Roman" w:hAnsi="Times New Roman"/>
+          <w:b/>
+          <w:color w:val="000000"/>
+          <w:sz w:val="23"/>
+        </w:rPr>
+        <w:t>1.3 Batasan Desain Antarmuka</w:t>
+      </w:r>
+    </w:p>
+    <w:p>
+      <w:pPr>
+        <w:spacing w:after="160" w:line="312" w:lineRule="auto"/>
+        <w:jc w:val="both"/>
+      </w:pPr>
+      <w:r>
+        <w:rPr>
+          <w:rFonts w:ascii="Times New Roman" w:hAnsi="Times New Roman"/>
+          <w:sz w:val="22"/>
+        </w:rPr>
+        <w:t>Batasan implementasi antarmuka pada Minggu II mencakup:</w:t>
+      </w:r>
+    </w:p>
+    <w:p>
+      <w:pPr>
+        <w:pStyle w:val="ListBullet"/>
+        <w:spacing w:after="80" w:line="288" w:lineRule="auto"/>
+        <w:jc w:val="both"/>
+      </w:pPr>
+      <w:r>
+        <w:rPr>
+          <w:rFonts w:ascii="Times New Roman" w:hAnsi="Times New Roman"/>
+          <w:sz w:val="22"/>
+        </w:rPr>
+        <w:t>Sistem desain mengadopsi spesifikasi Google Material Design 3 dengan kurasi palet warna resmi Unila.</w:t>
+      </w:r>
+    </w:p>
+    <w:p>
+      <w:pPr>
+        <w:pStyle w:val="ListBullet"/>
+        <w:spacing w:after="80" w:line="288" w:lineRule="auto"/>
+        <w:jc w:val="both"/>
+      </w:pPr>
+      <w:r>
+        <w:rPr>
+          <w:rFonts w:ascii="Times New Roman" w:hAnsi="Times New Roman"/>
+          <w:sz w:val="22"/>
+        </w:rPr>
+        <w:t>Manajemen state navigasi halaman menggunakan pola widget IndexedStack untuk preservasi status.</w:t>
+      </w:r>
+    </w:p>
+    <w:p>
+      <w:pPr>
+        <w:pStyle w:val="ListBullet"/>
+        <w:spacing w:after="80" w:line="288" w:lineRule="auto"/>
+        <w:jc w:val="both"/>
+      </w:pPr>
+      <w:r>
+        <w:rPr>
+          <w:rFonts w:ascii="Times New Roman" w:hAnsi="Times New Roman"/>
+          <w:sz w:val="22"/>
+        </w:rPr>
+        <w:t>Target orientasi layar dikunci pada mode potret (Portrait Mode) dengan penanganan Safe Area notch dan navigasi sistem.</w:t>
+      </w:r>
+    </w:p>
+    <w:p>
+      <w:pPr>
+        <w:keepNext/>
+        <w:spacing w:before="240" w:after="80"/>
+      </w:pPr>
+      <w:r>
+        <w:rPr>
+          <w:rFonts w:ascii="Times New Roman" w:hAnsi="Times New Roman"/>
+          <w:b/>
+          <w:color w:val="000000"/>
+          <w:sz w:val="23"/>
+        </w:rPr>
+        <w:t>1.4 Tujuan Praktikum Minggu II</w:t>
       </w:r>
     </w:p>
     <w:p>
@@ -384,7 +551,7 @@
           <w:rFonts w:ascii="Times New Roman" w:hAnsi="Times New Roman"/>
           <w:sz w:val="22"/>
         </w:rPr>
-        <w:t>Membangun Bottom Navigation Bar adaptif berbasis `IndexedStack` guna mempertahankan status data antar-tab.</w:t>
+        <w:t>Membangun Bottom Navigation Bar adaptif berbasis IndexedStack guna mempertahankan status data antar-tab.</w:t>
       </w:r>
     </w:p>
     <w:p>
@@ -432,6 +599,34 @@
     <w:p>
       <w:pPr>
         <w:keepNext/>
+        <w:spacing w:before="240" w:after="80"/>
+      </w:pPr>
+      <w:r>
+        <w:rPr>
+          <w:rFonts w:ascii="Times New Roman" w:hAnsi="Times New Roman"/>
+          <w:b/>
+          <w:color w:val="000000"/>
+          <w:sz w:val="23"/>
+        </w:rPr>
+        <w:t>1.5 Manfaat Praktikum</w:t>
+      </w:r>
+    </w:p>
+    <w:p>
+      <w:pPr>
+        <w:spacing w:after="160" w:line="312" w:lineRule="auto"/>
+        <w:jc w:val="both"/>
+      </w:pPr>
+      <w:r>
+        <w:rPr>
+          <w:rFonts w:ascii="Times New Roman" w:hAnsi="Times New Roman"/>
+          <w:sz w:val="22"/>
+        </w:rPr>
+        <w:t>Praktikum ini memberikan pengalaman komprehensif dalam slicing UI modern, penanganan responsive layout pada Android, serta menghasilkan prototype visual yang sangat representatif dan mudah digunakan oleh seluruh pengguna laboratorium.</w:t>
+      </w:r>
+    </w:p>
+    <w:p>
+      <w:pPr>
+        <w:keepNext/>
         <w:spacing w:before="280" w:after="40"/>
         <w:jc w:val="center"/>
       </w:pPr>
@@ -458,7 +653,7 @@
           <w:color w:val="000000"/>
           <w:sz w:val="26"/>
         </w:rPr>
-        <w:t>KAJIAN TEORI &amp; ARSITEKTUR NAVIGASI</w:t>
+        <w:t>LANDASAN TEORI &amp; ARSITEKTUR DESAIN ANTARMUKA</w:t>
       </w:r>
     </w:p>
     <w:p>
@@ -473,7 +668,7 @@
           <w:color w:val="000000"/>
           <w:sz w:val="23"/>
         </w:rPr>
-        <w:t>2.1 Sistem Desain Material 3 &amp; Unila Palette</w:t>
+        <w:t>2.1 Konsep Google Material Design 3 &amp; Tipografi Modern</w:t>
       </w:r>
     </w:p>
     <w:p>
@@ -486,7 +681,7 @@
           <w:rFonts w:ascii="Times New Roman" w:hAnsi="Times New Roman"/>
           <w:sz w:val="22"/>
         </w:rPr>
-        <w:t>Aplikasi menerapkan kurasi palet warna formal institusional: Primer Unila Navy (`0xFF0F3B7A`), Sekunder Sapphire Blue (`0xFF1E60B8`), Permukaan Kartu Slate Clean (`0xFFF8FAFC`), dan Teks Kontras Dark Charcoal (`0xFF1E293B`). Kombinasi ini menghadirkan wibawa institusional sekaligus kenyamanan visual pada mata pengguna.</w:t>
+        <w:t>Material Design 3 (Material You) merupakan evolusi desain antarmuka terbaru dari Google yang menitikberatkan pada personalisasi, kontras warna adaptif, serta hierarki visual yang tegas. Pada aplikasi LabInventory, elemen kartu (Card) diberi elevasi halus dengan radius sudut melengkung 16px, efek sentuhan ripple responsif, dan tipografi berbasis Google Fonts Poppins/Inter yang memiliki tingkat legibilitas tinggi.</w:t>
       </w:r>
     </w:p>
     <w:p>
@@ -501,7 +696,7 @@
           <w:color w:val="000000"/>
           <w:sz w:val="23"/>
         </w:rPr>
-        <w:t>2.2 Pola Navigasi Multi-Role Menggunakan IndexedStack</w:t>
+        <w:t>2.2 Desain Sistem &amp; Kurasi Palet Warna Resmi Universitas Lampung</w:t>
       </w:r>
     </w:p>
     <w:p>
@@ -514,7 +709,7 @@
           <w:rFonts w:ascii="Times New Roman" w:hAnsi="Times New Roman"/>
           <w:sz w:val="22"/>
         </w:rPr>
-        <w:t>Untuk mencegah terjadinya reload halaman yang boros memori saat berpindah tab, navigasi dibangun menggunakan widget `IndexedStack`. Melalui pendekatan ini, state input form maupun posisi scroll tetap dipertahankan (*preserve state*). Pembagian tab navigasi diuraikan pada tabel berikut:</w:t>
+        <w:t>Aplikasi menerapkan kurasi palet warna formal institusional Universitas Lampung guna membangun ikatan identitas kampus yang kuat:</w:t>
       </w:r>
     </w:p>
     <w:p>
@@ -528,7 +723,598 @@
           <w:b/>
           <w:sz w:val="21"/>
         </w:rPr>
-        <w:t>Tabel 2.1: Spesifikasi Pembagian Tab Bottom Navigation Bar per Role</w:t>
+        <w:t>Tabel 2.1: Spesifikasi Token Warna Sistem Desain Aplikasi LabInventory</w:t>
+      </w:r>
+    </w:p>
+    <w:tbl>
+      <w:tblPr>
+        <w:tblW w:type="auto" w:w="0"/>
+        <w:jc w:val="center"/>
+        <w:tblLook w:firstColumn="1" w:firstRow="1" w:lastColumn="0" w:lastRow="0" w:noHBand="0" w:noVBand="1" w:val="04A0"/>
+        <w:tblBorders>
+          <w:top w:val="single" w:sz="12" w:space="0" w:color="000000"/>
+          <w:left w:val="none"/>
+          <w:bottom w:val="single" w:sz="12" w:space="0" w:color="000000"/>
+          <w:right w:val="none"/>
+          <w:insideH w:val="single" w:sz="4" w:space="0" w:color="CCCCCC"/>
+          <w:insideV w:val="none"/>
+        </w:tblBorders>
+      </w:tblPr>
+      <w:tblGrid>
+        <w:gridCol w:w="3034"/>
+        <w:gridCol w:w="3034"/>
+        <w:gridCol w:w="3034"/>
+      </w:tblGrid>
+      <w:tr>
+        <w:tc>
+          <w:tcPr>
+            <w:tcW w:type="dxa" w:w="2592"/>
+            <w:shd w:fill="1E3A8A"/>
+            <w:tcMar>
+              <w:top w:w="100" w:type="dxa"/>
+              <w:bottom w:w="100" w:type="dxa"/>
+              <w:left w:w="120" w:type="dxa"/>
+              <w:right w:w="120" w:type="dxa"/>
+            </w:tcMar>
+          </w:tcPr>
+          <w:p>
+            <w:pPr>
+              <w:jc w:val="center"/>
+            </w:pPr>
+            <w:r>
+              <w:rPr>
+                <w:rFonts w:ascii="Times New Roman" w:hAnsi="Times New Roman"/>
+                <w:b/>
+                <w:color w:val="FFFFFF"/>
+                <w:sz w:val="20"/>
+              </w:rPr>
+              <w:t>Nama Token Warna</w:t>
+            </w:r>
+          </w:p>
+        </w:tc>
+        <w:tc>
+          <w:tcPr>
+            <w:tcW w:type="dxa" w:w="2016"/>
+            <w:shd w:fill="1E3A8A"/>
+            <w:tcMar>
+              <w:top w:w="100" w:type="dxa"/>
+              <w:bottom w:w="100" w:type="dxa"/>
+              <w:left w:w="120" w:type="dxa"/>
+              <w:right w:w="120" w:type="dxa"/>
+            </w:tcMar>
+          </w:tcPr>
+          <w:p>
+            <w:pPr>
+              <w:jc w:val="center"/>
+            </w:pPr>
+            <w:r>
+              <w:rPr>
+                <w:rFonts w:ascii="Times New Roman" w:hAnsi="Times New Roman"/>
+                <w:b/>
+                <w:color w:val="FFFFFF"/>
+                <w:sz w:val="20"/>
+              </w:rPr>
+              <w:t>Kode Heksadesimal</w:t>
+            </w:r>
+          </w:p>
+        </w:tc>
+        <w:tc>
+          <w:tcPr>
+            <w:tcW w:type="dxa" w:w="5472"/>
+            <w:shd w:fill="1E3A8A"/>
+            <w:tcMar>
+              <w:top w:w="100" w:type="dxa"/>
+              <w:bottom w:w="100" w:type="dxa"/>
+              <w:left w:w="120" w:type="dxa"/>
+              <w:right w:w="120" w:type="dxa"/>
+            </w:tcMar>
+          </w:tcPr>
+          <w:p>
+            <w:pPr>
+              <w:jc w:val="center"/>
+            </w:pPr>
+            <w:r>
+              <w:rPr>
+                <w:rFonts w:ascii="Times New Roman" w:hAnsi="Times New Roman"/>
+                <w:b/>
+                <w:color w:val="FFFFFF"/>
+                <w:sz w:val="20"/>
+              </w:rPr>
+              <w:t>Peranan Visual &amp; Semantik</w:t>
+            </w:r>
+          </w:p>
+        </w:tc>
+      </w:tr>
+      <w:tr>
+        <w:tc>
+          <w:tcPr>
+            <w:tcW w:type="dxa" w:w="2592"/>
+            <w:shd w:fill="FFFFFF"/>
+            <w:tcMar>
+              <w:top w:w="80" w:type="dxa"/>
+              <w:bottom w:w="80" w:type="dxa"/>
+              <w:left w:w="120" w:type="dxa"/>
+              <w:right w:w="120" w:type="dxa"/>
+            </w:tcMar>
+          </w:tcPr>
+          <w:p>
+            <w:pPr>
+              <w:jc w:val="center"/>
+            </w:pPr>
+            <w:r>
+              <w:rPr>
+                <w:rFonts w:ascii="Times New Roman" w:hAnsi="Times New Roman"/>
+                <w:sz w:val="19"/>
+              </w:rPr>
+              <w:t>Primary Navy Unila</w:t>
+            </w:r>
+          </w:p>
+        </w:tc>
+        <w:tc>
+          <w:tcPr>
+            <w:tcW w:type="dxa" w:w="2016"/>
+            <w:shd w:fill="FFFFFF"/>
+            <w:tcMar>
+              <w:top w:w="80" w:type="dxa"/>
+              <w:bottom w:w="80" w:type="dxa"/>
+              <w:left w:w="120" w:type="dxa"/>
+              <w:right w:w="120" w:type="dxa"/>
+            </w:tcMar>
+          </w:tcPr>
+          <w:p>
+            <w:pPr>
+              <w:jc w:val="left"/>
+            </w:pPr>
+            <w:r>
+              <w:rPr>
+                <w:rFonts w:ascii="Times New Roman" w:hAnsi="Times New Roman"/>
+                <w:sz w:val="19"/>
+              </w:rPr>
+              <w:t>#0F3B7A</w:t>
+            </w:r>
+          </w:p>
+        </w:tc>
+        <w:tc>
+          <w:tcPr>
+            <w:tcW w:type="dxa" w:w="5472"/>
+            <w:shd w:fill="FFFFFF"/>
+            <w:tcMar>
+              <w:top w:w="80" w:type="dxa"/>
+              <w:bottom w:w="80" w:type="dxa"/>
+              <w:left w:w="120" w:type="dxa"/>
+              <w:right w:w="120" w:type="dxa"/>
+            </w:tcMar>
+          </w:tcPr>
+          <w:p>
+            <w:pPr>
+              <w:jc w:val="left"/>
+            </w:pPr>
+            <w:r>
+              <w:rPr>
+                <w:rFonts w:ascii="Times New Roman" w:hAnsi="Times New Roman"/>
+                <w:sz w:val="19"/>
+              </w:rPr>
+              <w:t>Warna identitas almamater utama pada AppBar, tombol aksi utama, dan kartu aktif.</w:t>
+            </w:r>
+          </w:p>
+        </w:tc>
+      </w:tr>
+      <w:tr>
+        <w:tc>
+          <w:tcPr>
+            <w:tcW w:type="dxa" w:w="2592"/>
+            <w:shd w:fill="F1F5F9"/>
+            <w:tcMar>
+              <w:top w:w="80" w:type="dxa"/>
+              <w:bottom w:w="80" w:type="dxa"/>
+              <w:left w:w="120" w:type="dxa"/>
+              <w:right w:w="120" w:type="dxa"/>
+            </w:tcMar>
+          </w:tcPr>
+          <w:p>
+            <w:pPr>
+              <w:jc w:val="center"/>
+            </w:pPr>
+            <w:r>
+              <w:rPr>
+                <w:rFonts w:ascii="Times New Roman" w:hAnsi="Times New Roman"/>
+                <w:sz w:val="19"/>
+              </w:rPr>
+              <w:t>Secondary Sapphire</w:t>
+            </w:r>
+          </w:p>
+        </w:tc>
+        <w:tc>
+          <w:tcPr>
+            <w:tcW w:type="dxa" w:w="2016"/>
+            <w:shd w:fill="F1F5F9"/>
+            <w:tcMar>
+              <w:top w:w="80" w:type="dxa"/>
+              <w:bottom w:w="80" w:type="dxa"/>
+              <w:left w:w="120" w:type="dxa"/>
+              <w:right w:w="120" w:type="dxa"/>
+            </w:tcMar>
+          </w:tcPr>
+          <w:p>
+            <w:pPr>
+              <w:jc w:val="left"/>
+            </w:pPr>
+            <w:r>
+              <w:rPr>
+                <w:rFonts w:ascii="Times New Roman" w:hAnsi="Times New Roman"/>
+                <w:sz w:val="19"/>
+              </w:rPr>
+              <w:t>#1E60B8</w:t>
+            </w:r>
+          </w:p>
+        </w:tc>
+        <w:tc>
+          <w:tcPr>
+            <w:tcW w:type="dxa" w:w="5472"/>
+            <w:shd w:fill="F1F5F9"/>
+            <w:tcMar>
+              <w:top w:w="80" w:type="dxa"/>
+              <w:bottom w:w="80" w:type="dxa"/>
+              <w:left w:w="120" w:type="dxa"/>
+              <w:right w:w="120" w:type="dxa"/>
+            </w:tcMar>
+          </w:tcPr>
+          <w:p>
+            <w:pPr>
+              <w:jc w:val="left"/>
+            </w:pPr>
+            <w:r>
+              <w:rPr>
+                <w:rFonts w:ascii="Times New Roman" w:hAnsi="Times New Roman"/>
+                <w:sz w:val="19"/>
+              </w:rPr>
+              <w:t>Warna aksen pendukung pada indikator navigasi dan ikon interaktif.</w:t>
+            </w:r>
+          </w:p>
+        </w:tc>
+      </w:tr>
+      <w:tr>
+        <w:tc>
+          <w:tcPr>
+            <w:tcW w:type="dxa" w:w="2592"/>
+            <w:shd w:fill="FFFFFF"/>
+            <w:tcMar>
+              <w:top w:w="80" w:type="dxa"/>
+              <w:bottom w:w="80" w:type="dxa"/>
+              <w:left w:w="120" w:type="dxa"/>
+              <w:right w:w="120" w:type="dxa"/>
+            </w:tcMar>
+          </w:tcPr>
+          <w:p>
+            <w:pPr>
+              <w:jc w:val="center"/>
+            </w:pPr>
+            <w:r>
+              <w:rPr>
+                <w:rFonts w:ascii="Times New Roman" w:hAnsi="Times New Roman"/>
+                <w:sz w:val="19"/>
+              </w:rPr>
+              <w:t>Accent Gold Unila</w:t>
+            </w:r>
+          </w:p>
+        </w:tc>
+        <w:tc>
+          <w:tcPr>
+            <w:tcW w:type="dxa" w:w="2016"/>
+            <w:shd w:fill="FFFFFF"/>
+            <w:tcMar>
+              <w:top w:w="80" w:type="dxa"/>
+              <w:bottom w:w="80" w:type="dxa"/>
+              <w:left w:w="120" w:type="dxa"/>
+              <w:right w:w="120" w:type="dxa"/>
+            </w:tcMar>
+          </w:tcPr>
+          <w:p>
+            <w:pPr>
+              <w:jc w:val="left"/>
+            </w:pPr>
+            <w:r>
+              <w:rPr>
+                <w:rFonts w:ascii="Times New Roman" w:hAnsi="Times New Roman"/>
+                <w:sz w:val="19"/>
+              </w:rPr>
+              <w:t>#F59E0B</w:t>
+            </w:r>
+          </w:p>
+        </w:tc>
+        <w:tc>
+          <w:tcPr>
+            <w:tcW w:type="dxa" w:w="5472"/>
+            <w:shd w:fill="FFFFFF"/>
+            <w:tcMar>
+              <w:top w:w="80" w:type="dxa"/>
+              <w:bottom w:w="80" w:type="dxa"/>
+              <w:left w:w="120" w:type="dxa"/>
+              <w:right w:w="120" w:type="dxa"/>
+            </w:tcMar>
+          </w:tcPr>
+          <w:p>
+            <w:pPr>
+              <w:jc w:val="left"/>
+            </w:pPr>
+            <w:r>
+              <w:rPr>
+                <w:rFonts w:ascii="Times New Roman" w:hAnsi="Times New Roman"/>
+                <w:sz w:val="19"/>
+              </w:rPr>
+              <w:t>Warna penegas pada badge status 'Pending' dan bintang rating alat.</w:t>
+            </w:r>
+          </w:p>
+        </w:tc>
+      </w:tr>
+      <w:tr>
+        <w:tc>
+          <w:tcPr>
+            <w:tcW w:type="dxa" w:w="2592"/>
+            <w:shd w:fill="F1F5F9"/>
+            <w:tcMar>
+              <w:top w:w="80" w:type="dxa"/>
+              <w:bottom w:w="80" w:type="dxa"/>
+              <w:left w:w="120" w:type="dxa"/>
+              <w:right w:w="120" w:type="dxa"/>
+            </w:tcMar>
+          </w:tcPr>
+          <w:p>
+            <w:pPr>
+              <w:jc w:val="center"/>
+            </w:pPr>
+            <w:r>
+              <w:rPr>
+                <w:rFonts w:ascii="Times New Roman" w:hAnsi="Times New Roman"/>
+                <w:sz w:val="19"/>
+              </w:rPr>
+              <w:t>Surface Slate Clean</w:t>
+            </w:r>
+          </w:p>
+        </w:tc>
+        <w:tc>
+          <w:tcPr>
+            <w:tcW w:type="dxa" w:w="2016"/>
+            <w:shd w:fill="F1F5F9"/>
+            <w:tcMar>
+              <w:top w:w="80" w:type="dxa"/>
+              <w:bottom w:w="80" w:type="dxa"/>
+              <w:left w:w="120" w:type="dxa"/>
+              <w:right w:w="120" w:type="dxa"/>
+            </w:tcMar>
+          </w:tcPr>
+          <w:p>
+            <w:pPr>
+              <w:jc w:val="left"/>
+            </w:pPr>
+            <w:r>
+              <w:rPr>
+                <w:rFonts w:ascii="Times New Roman" w:hAnsi="Times New Roman"/>
+                <w:sz w:val="19"/>
+              </w:rPr>
+              <w:t>#F8FAFC</w:t>
+            </w:r>
+          </w:p>
+        </w:tc>
+        <w:tc>
+          <w:tcPr>
+            <w:tcW w:type="dxa" w:w="5472"/>
+            <w:shd w:fill="F1F5F9"/>
+            <w:tcMar>
+              <w:top w:w="80" w:type="dxa"/>
+              <w:bottom w:w="80" w:type="dxa"/>
+              <w:left w:w="120" w:type="dxa"/>
+              <w:right w:w="120" w:type="dxa"/>
+            </w:tcMar>
+          </w:tcPr>
+          <w:p>
+            <w:pPr>
+              <w:jc w:val="left"/>
+            </w:pPr>
+            <w:r>
+              <w:rPr>
+                <w:rFonts w:ascii="Times New Roman" w:hAnsi="Times New Roman"/>
+                <w:sz w:val="19"/>
+              </w:rPr>
+              <w:t>Warna latar belakang aplikasi yang bersih, modern, dan tidak melelahkan mata.</w:t>
+            </w:r>
+          </w:p>
+        </w:tc>
+      </w:tr>
+      <w:tr>
+        <w:tc>
+          <w:tcPr>
+            <w:tcW w:type="dxa" w:w="2592"/>
+            <w:shd w:fill="FFFFFF"/>
+            <w:tcMar>
+              <w:top w:w="80" w:type="dxa"/>
+              <w:bottom w:w="80" w:type="dxa"/>
+              <w:left w:w="120" w:type="dxa"/>
+              <w:right w:w="120" w:type="dxa"/>
+            </w:tcMar>
+          </w:tcPr>
+          <w:p>
+            <w:pPr>
+              <w:jc w:val="center"/>
+            </w:pPr>
+            <w:r>
+              <w:rPr>
+                <w:rFonts w:ascii="Times New Roman" w:hAnsi="Times New Roman"/>
+                <w:sz w:val="19"/>
+              </w:rPr>
+              <w:t>Text Charcoal High</w:t>
+            </w:r>
+          </w:p>
+        </w:tc>
+        <w:tc>
+          <w:tcPr>
+            <w:tcW w:type="dxa" w:w="2016"/>
+            <w:shd w:fill="FFFFFF"/>
+            <w:tcMar>
+              <w:top w:w="80" w:type="dxa"/>
+              <w:bottom w:w="80" w:type="dxa"/>
+              <w:left w:w="120" w:type="dxa"/>
+              <w:right w:w="120" w:type="dxa"/>
+            </w:tcMar>
+          </w:tcPr>
+          <w:p>
+            <w:pPr>
+              <w:jc w:val="left"/>
+            </w:pPr>
+            <w:r>
+              <w:rPr>
+                <w:rFonts w:ascii="Times New Roman" w:hAnsi="Times New Roman"/>
+                <w:sz w:val="19"/>
+              </w:rPr>
+              <w:t>#1E293B</w:t>
+            </w:r>
+          </w:p>
+        </w:tc>
+        <w:tc>
+          <w:tcPr>
+            <w:tcW w:type="dxa" w:w="5472"/>
+            <w:shd w:fill="FFFFFF"/>
+            <w:tcMar>
+              <w:top w:w="80" w:type="dxa"/>
+              <w:bottom w:w="80" w:type="dxa"/>
+              <w:left w:w="120" w:type="dxa"/>
+              <w:right w:w="120" w:type="dxa"/>
+            </w:tcMar>
+          </w:tcPr>
+          <w:p>
+            <w:pPr>
+              <w:jc w:val="left"/>
+            </w:pPr>
+            <w:r>
+              <w:rPr>
+                <w:rFonts w:ascii="Times New Roman" w:hAnsi="Times New Roman"/>
+                <w:sz w:val="19"/>
+              </w:rPr>
+              <w:t>Warna teks judul dan body untuk memastikan rasio kontras rasio WCAG AAA.</w:t>
+            </w:r>
+          </w:p>
+        </w:tc>
+      </w:tr>
+      <w:tr>
+        <w:tc>
+          <w:tcPr>
+            <w:tcW w:type="dxa" w:w="2592"/>
+            <w:shd w:fill="F1F5F9"/>
+            <w:tcMar>
+              <w:top w:w="80" w:type="dxa"/>
+              <w:bottom w:w="80" w:type="dxa"/>
+              <w:left w:w="120" w:type="dxa"/>
+              <w:right w:w="120" w:type="dxa"/>
+            </w:tcMar>
+          </w:tcPr>
+          <w:p>
+            <w:pPr>
+              <w:jc w:val="center"/>
+            </w:pPr>
+            <w:r>
+              <w:rPr>
+                <w:rFonts w:ascii="Times New Roman" w:hAnsi="Times New Roman"/>
+                <w:sz w:val="19"/>
+              </w:rPr>
+              <w:t>Error Crimson Alert</w:t>
+            </w:r>
+          </w:p>
+        </w:tc>
+        <w:tc>
+          <w:tcPr>
+            <w:tcW w:type="dxa" w:w="2016"/>
+            <w:shd w:fill="F1F5F9"/>
+            <w:tcMar>
+              <w:top w:w="80" w:type="dxa"/>
+              <w:bottom w:w="80" w:type="dxa"/>
+              <w:left w:w="120" w:type="dxa"/>
+              <w:right w:w="120" w:type="dxa"/>
+            </w:tcMar>
+          </w:tcPr>
+          <w:p>
+            <w:pPr>
+              <w:jc w:val="left"/>
+            </w:pPr>
+            <w:r>
+              <w:rPr>
+                <w:rFonts w:ascii="Times New Roman" w:hAnsi="Times New Roman"/>
+                <w:sz w:val="19"/>
+              </w:rPr>
+              <w:t>#EF4444</w:t>
+            </w:r>
+          </w:p>
+        </w:tc>
+        <w:tc>
+          <w:tcPr>
+            <w:tcW w:type="dxa" w:w="5472"/>
+            <w:shd w:fill="F1F5F9"/>
+            <w:tcMar>
+              <w:top w:w="80" w:type="dxa"/>
+              <w:bottom w:w="80" w:type="dxa"/>
+              <w:left w:w="120" w:type="dxa"/>
+              <w:right w:w="120" w:type="dxa"/>
+            </w:tcMar>
+          </w:tcPr>
+          <w:p>
+            <w:pPr>
+              <w:jc w:val="left"/>
+            </w:pPr>
+            <w:r>
+              <w:rPr>
+                <w:rFonts w:ascii="Times New Roman" w:hAnsi="Times New Roman"/>
+                <w:sz w:val="19"/>
+              </w:rPr>
+              <w:t>Warna peringatan stok habis, validasi error form, dan barang kondisi rusak.</w:t>
+            </w:r>
+          </w:p>
+        </w:tc>
+      </w:tr>
+    </w:tbl>
+    <w:p>
+      <w:pPr>
+        <w:spacing w:after="160"/>
+      </w:pPr>
+    </w:p>
+    <w:p>
+      <w:pPr>
+        <w:keepNext/>
+        <w:spacing w:before="240" w:after="80"/>
+      </w:pPr>
+      <w:r>
+        <w:rPr>
+          <w:rFonts w:ascii="Times New Roman" w:hAnsi="Times New Roman"/>
+          <w:b/>
+          <w:color w:val="000000"/>
+          <w:sz w:val="23"/>
+        </w:rPr>
+        <w:t>2.3 Pola Navigasi Multi-Role Menggunakan IndexedStack</w:t>
+      </w:r>
+    </w:p>
+    <w:p>
+      <w:pPr>
+        <w:spacing w:after="160" w:line="312" w:lineRule="auto"/>
+        <w:jc w:val="both"/>
+      </w:pPr>
+      <w:r>
+        <w:rPr>
+          <w:rFonts w:ascii="Times New Roman" w:hAnsi="Times New Roman"/>
+          <w:sz w:val="22"/>
+        </w:rPr>
+        <w:t>Untuk mencegah terjadinya reload halaman yang boros memori dan menghilangkan input form saat berpindah tab, navigasi dibangun menggunakan widget `IndexedStack`. Melalui pendekatan ini, state input form maupun posisi scroll tetap dipertahankan (*preserve state*). Pembagian tab navigasi diuraikan pada tabel berikut:</w:t>
+      </w:r>
+    </w:p>
+    <w:p>
+      <w:pPr>
+        <w:keepNext/>
+        <w:spacing w:before="160" w:after="80"/>
+      </w:pPr>
+      <w:r>
+        <w:rPr>
+          <w:rFonts w:ascii="Times New Roman" w:hAnsi="Times New Roman"/>
+          <w:b/>
+          <w:sz w:val="21"/>
+        </w:rPr>
+        <w:t>Tabel 2.2: Spesifikasi Pembagian Tab Bottom Navigation Bar per Role</w:t>
       </w:r>
     </w:p>
     <w:tbl>
@@ -862,6 +1648,34 @@
     <w:p>
       <w:pPr>
         <w:keepNext/>
+        <w:spacing w:before="240" w:after="80"/>
+      </w:pPr>
+      <w:r>
+        <w:rPr>
+          <w:rFonts w:ascii="Times New Roman" w:hAnsi="Times New Roman"/>
+          <w:b/>
+          <w:color w:val="000000"/>
+          <w:sz w:val="23"/>
+        </w:rPr>
+        <w:t>2.4 Perancangan Formulir Digital &amp; Sanitasi Input</w:t>
+      </w:r>
+    </w:p>
+    <w:p>
+      <w:pPr>
+        <w:spacing w:after="160" w:line="312" w:lineRule="auto"/>
+        <w:jc w:val="both"/>
+      </w:pPr>
+      <w:r>
+        <w:rPr>
+          <w:rFonts w:ascii="Times New Roman" w:hAnsi="Times New Roman"/>
+          <w:sz w:val="22"/>
+        </w:rPr>
+        <w:t>Formulir permohonan peminjaman dirancang dengan komponen validasi interaktif: DatePicker waktu lokal Indonesia Barat (WIB), stepper kuota jumlah barang dengan pembatas stok maksimal, serta sanitasi teks pada kolom keperluan praktikum untuk mencegah input kosong.</w:t>
+      </w:r>
+    </w:p>
+    <w:p>
+      <w:pPr>
+        <w:keepNext/>
         <w:spacing w:before="280" w:after="40"/>
         <w:jc w:val="center"/>
       </w:pPr>
@@ -1124,7 +1938,7 @@
           <w:color w:val="000000"/>
           <w:sz w:val="23"/>
         </w:rPr>
-        <w:t>3.3 Formulir Digital Peminjaman &amp; Solusi Safe Area Keyboard</w:t>
+        <w:t>3.3 Formulir Digital Pengajuan Peminjaman</w:t>
       </w:r>
     </w:p>
     <w:p>
@@ -1137,7 +1951,7 @@
           <w:rFonts w:ascii="Times New Roman" w:hAnsi="Times New Roman"/>
           <w:sz w:val="22"/>
         </w:rPr>
-        <w:t>Formulir pengajuan peminjaman menyediakan komponen DatePicker kalender (WIB), pengatur jumlah unit, dan kolom keperluan. Saat pengujian pada smartphone Android, ditemukan kendala di mana keyboard virtual menutupi tombol submit. Solusi dilakukan dengan membungkus antarmuka ke dalam `SafeArea` dan `SingleChildScrollView`, sehingga layout bergeser ke atas secara proporsional saat input teks aktif.</w:t>
+        <w:t>Formulir pengajuan peminjaman menyediakan komponen DatePicker kalender (WIB), pengatur kuota jumlah unit, dan kolom deskripsi keperluan praktikum. Pengguna dipandu dengan petunjuk visual batas maksimal stok alat yang masih tersedia di laboratorium.</w:t>
       </w:r>
     </w:p>
     <w:p>
@@ -1198,6 +2012,37 @@
     <w:p>
       <w:pPr>
         <w:keepNext/>
+        <w:spacing w:before="240" w:after="80"/>
+      </w:pPr>
+      <w:r>
+        <w:rPr>
+          <w:rFonts w:ascii="Times New Roman" w:hAnsi="Times New Roman"/>
+          <w:b/>
+          <w:color w:val="000000"/>
+          <w:sz w:val="23"/>
+        </w:rPr>
+        <w:t>3.4 Pemecahan Masalah Layout: Perbaikan Keyboard Overflow dengan SafeArea</w:t>
+      </w:r>
+    </w:p>
+    <w:p>
+      <w:pPr>
+        <w:spacing w:after="160" w:line="312" w:lineRule="auto"/>
+        <w:jc w:val="both"/>
+      </w:pPr>
+      <w:r>
+        <w:rPr>
+          <w:rFonts w:ascii="Times New Roman" w:hAnsi="Times New Roman"/>
+          <w:sz w:val="22"/>
+        </w:rPr>
+        <w:t>Kendala Teknis: Saat pengujian pada smartphone Android fisik, ketika pengguna mengklik kolom teks keperluan, soft-keyboard virtual muncul dan menutupi separuh bawah layar, memicu galat 'A RenderFlex overflowed by XX pixels' pada konsol Flutter.</w:t>
+        <w:br/>
+        <w:br/>
+        <w:t>Solusi Problem-Solving: Seluruh struktur formulir dibungkus kembali dengan widget `SafeArea` dan `SingleChildScrollView` dengan physics `ClampingScrollPhysics()`. Dengan perbaikan ini, layout secara otomatis bergeser ke atas secara proporsional ketika keyboard virtual aktif, menjamin seluruh bidang input dan tombol submit tetap dapat diakses dengan nyaman.</w:t>
+      </w:r>
+    </w:p>
+    <w:p>
+      <w:pPr>
+        <w:keepNext/>
         <w:spacing w:before="200" w:after="80"/>
         <w:jc w:val="center"/>
       </w:pPr>
@@ -1206,6 +2051,61 @@
           <wp:inline xmlns:a="http://schemas.openxmlformats.org/drawingml/2006/main" xmlns:pic="http://schemas.openxmlformats.org/drawingml/2006/picture">
             <wp:extent cx="2834640" cy="6456680"/>
             <wp:docPr id="6" name="Picture 6"/>
+            <wp:cNvGraphicFramePr>
+              <a:graphicFrameLocks noChangeAspect="1"/>
+            </wp:cNvGraphicFramePr>
+            <a:graphic>
+              <a:graphicData uri="http://schemas.openxmlformats.org/drawingml/2006/picture">
+                <pic:pic>
+                  <pic:nvPicPr>
+                    <pic:cNvPr id="0" name="02-student-form.png"/>
+                    <pic:cNvPicPr/>
+                  </pic:nvPicPr>
+                  <pic:blipFill>
+                    <a:blip r:embed="rId13"/>
+                    <a:stretch>
+                      <a:fillRect/>
+                    </a:stretch>
+                  </pic:blipFill>
+                  <pic:spPr>
+                    <a:xfrm>
+                      <a:off x="0" y="0"/>
+                      <a:ext cx="2834640" cy="6456680"/>
+                    </a:xfrm>
+                    <a:prstGeom prst="rect"/>
+                  </pic:spPr>
+                </pic:pic>
+              </a:graphicData>
+            </a:graphic>
+          </wp:inline>
+        </w:drawing>
+      </w:r>
+    </w:p>
+    <w:p>
+      <w:pPr>
+        <w:spacing w:after="240"/>
+        <w:jc w:val="center"/>
+      </w:pPr>
+      <w:r>
+        <w:rPr>
+          <w:rFonts w:ascii="Times New Roman" w:hAnsi="Times New Roman"/>
+          <w:i/>
+          <w:sz w:val="20"/>
+        </w:rPr>
+        <w:t>Gambar 2.5: Tampilan Formulir Sebelum Perbaikan (Layout Tertekan / Tertutup Keyboard)</w:t>
+      </w:r>
+    </w:p>
+    <w:p>
+      <w:pPr>
+        <w:keepNext/>
+        <w:spacing w:before="200" w:after="80"/>
+        <w:jc w:val="center"/>
+      </w:pPr>
+      <w:r>
+        <w:drawing>
+          <wp:inline xmlns:a="http://schemas.openxmlformats.org/drawingml/2006/main" xmlns:pic="http://schemas.openxmlformats.org/drawingml/2006/picture">
+            <wp:extent cx="2834640" cy="6456680"/>
+            <wp:docPr id="7" name="Picture 7"/>
             <wp:cNvGraphicFramePr>
               <a:graphicFrameLocks noChangeAspect="1"/>
             </wp:cNvGraphicFramePr>
@@ -1247,7 +2147,7 @@
           <w:i/>
           <w:sz w:val="20"/>
         </w:rPr>
-        <w:t>Gambar 2.5: Bukti Perbaikan Layout Safe Area: Bidang Input Bebas Tumpang Tindih Keyboard</w:t>
+        <w:t>Gambar 2.6: Bukti Perbaikan Layout Safe Area: Bidang Input Bebas Tumpang Tindih Keyboard</w:t>
       </w:r>
     </w:p>
     <w:p>
@@ -1307,7 +2207,7 @@
           <w:rFonts w:ascii="Times New Roman" w:hAnsi="Times New Roman"/>
           <w:sz w:val="22"/>
         </w:rPr>
-        <w:t>Seluruh kebutuhan desain antarmuka Material Design 3, Bottom Navigation Bar multi-role, katalog pencarian, dan formulir peminjaman telah berhasil diwujudkan secara tuntas (100%).</w:t>
+        <w:t>Seluruh kebutuhan desain antarmuka Material Design 3 (Unila Palette), Bottom Navigation Bar multi-role berbasis IndexedStack, katalog pencarian interaktif, serta penanganan masalah responsive layout dan keyboard overflow pada Minggu II telah berhasil diwujudkan secara paripurna (100%).</w:t>
       </w:r>
     </w:p>
     <w:p>
@@ -1335,7 +2235,7 @@
           <w:rFonts w:ascii="Times New Roman" w:hAnsi="Times New Roman"/>
           <w:sz w:val="22"/>
         </w:rPr>
-        <w:t>Pada Minggu III, antarmuka yang telah dibangun akan diintegrasikan secara langsung ke Cloud Database Supabase (PostgreSQL 15), menerapkan autentikasi GoTrue JWT, dan mengonfigurasi Row Level Security (RLS) serta membersihkan dummy data.</w:t>
+        <w:t>Pada Minggu III, antarmuka yang telah dibangun akan diintegrasikan secara langsung ke Cloud Database Supabase (PostgreSQL 15), menerapkan autentikasi GoTrue JWT, mengonfigurasi Row Level Security (RLS), serta membersihkan seluruh data tiruan (dummy data).</w:t>
       </w:r>
     </w:p>
     <w:p>

</xml_diff>